<commit_message>
AA2-EV02: incrustar capturas reales en el documento y actualizar .gitignore
</commit_message>
<xml_diff>
--- a/documento/AA2-EV02.docx
+++ b/documento/AA2-EV02.docx
@@ -2234,15 +2234,86 @@
         <w:t xml:space="preserve">evidencias/02-docker/docker-info.txt</w:t>
       </w:r>
       <w:r>
+        <w:t xml:space="preserve">,</w:t>
+      </w:r>
+      <w:r>
+        <w:t xml:space="preserve"> </w:t>
+      </w:r>
+      <w:r>
+        <w:rPr>
+          <w:rStyle w:val="VerbatimChar"/>
+        </w:rPr>
+        <w:t xml:space="preserve">evidencias/02-docker/docker-version-info.png</w:t>
+      </w:r>
+      <w:r>
+        <w:t xml:space="preserve">,</w:t>
+      </w:r>
+      <w:r>
+        <w:t xml:space="preserve"> </w:t>
+      </w:r>
+      <w:r>
+        <w:rPr>
+          <w:rStyle w:val="VerbatimChar"/>
+        </w:rPr>
+        <w:t xml:space="preserve">evidencias/02-docker/docker-info-server.png</w:t>
+      </w:r>
+      <w:r>
         <w:t xml:space="preserve">.</w:t>
       </w:r>
     </w:p>
     <w:p>
       <w:pPr>
-        <w:pStyle w:val="BlockText"/>
-      </w:pPr>
-      <w:r>
-        <w:t xml:space="preserve">Figura 2. Verificación del motor Docker mediante</w:t>
+        <w:pStyle w:val="CaptionedFigure"/>
+      </w:pPr>
+      <w:r>
+        <w:drawing>
+          <wp:inline>
+            <wp:extent cx="4693920" cy="5320496"/>
+            <wp:effectExtent b="0" l="0" r="0" t="0"/>
+            <wp:docPr descr="Figura 2. Verificación del motor Docker: docker --version (29.7.2) y docker info (cliente y plugins)." title="" id="20" name="Picture"/>
+            <a:graphic>
+              <a:graphicData uri="http://schemas.openxmlformats.org/drawingml/2006/picture">
+                <pic:pic>
+                  <pic:nvPicPr>
+                    <pic:cNvPr descr="../evidencias/02-docker/docker-version-info.png" id="21" name="Picture"/>
+                    <pic:cNvPicPr>
+                      <a:picLocks noChangeArrowheads="1" noChangeAspect="1"/>
+                    </pic:cNvPicPr>
+                  </pic:nvPicPr>
+                  <pic:blipFill>
+                    <a:blip r:embed="rId19"/>
+                    <a:stretch>
+                      <a:fillRect/>
+                    </a:stretch>
+                  </pic:blipFill>
+                  <pic:spPr bwMode="auto">
+                    <a:xfrm>
+                      <a:off x="0" y="0"/>
+                      <a:ext cx="4693920" cy="5320496"/>
+                    </a:xfrm>
+                    <a:prstGeom prst="rect">
+                      <a:avLst/>
+                    </a:prstGeom>
+                    <a:noFill/>
+                    <a:ln w="9525">
+                      <a:noFill/>
+                      <a:headEnd/>
+                      <a:tailEnd/>
+                    </a:ln>
+                  </pic:spPr>
+                </pic:pic>
+              </a:graphicData>
+            </a:graphic>
+          </wp:inline>
+        </w:drawing>
+      </w:r>
+    </w:p>
+    <w:p>
+      <w:pPr>
+        <w:pStyle w:val="ImageCaption"/>
+      </w:pPr>
+      <w:r>
+        <w:t xml:space="preserve">Figura 2. Verificación del motor Docker:</w:t>
       </w:r>
       <w:r>
         <w:t xml:space="preserve"> </w:t>
@@ -2254,6 +2325,106 @@
         <w:t xml:space="preserve">docker --version</w:t>
       </w:r>
       <w:r>
+        <w:t xml:space="preserve"> </w:t>
+      </w:r>
+      <w:r>
+        <w:t xml:space="preserve">(29.7.2) y</w:t>
+      </w:r>
+      <w:r>
+        <w:t xml:space="preserve"> </w:t>
+      </w:r>
+      <w:r>
+        <w:rPr>
+          <w:rStyle w:val="VerbatimChar"/>
+        </w:rPr>
+        <w:t xml:space="preserve">docker info</w:t>
+      </w:r>
+      <w:r>
+        <w:t xml:space="preserve"> </w:t>
+      </w:r>
+      <w:r>
+        <w:t xml:space="preserve">(cliente y plugins).</w:t>
+      </w:r>
+    </w:p>
+    <w:p>
+      <w:pPr>
+        <w:pStyle w:val="CaptionedFigure"/>
+      </w:pPr>
+      <w:r>
+        <w:drawing>
+          <wp:inline>
+            <wp:extent cx="4693920" cy="6000750"/>
+            <wp:effectExtent b="0" l="0" r="0" t="0"/>
+            <wp:docPr descr="Figura 3. docker info — sección del servidor: Server Version 29.7.2, Storage Driver: overlayfs, Operating System: Docker Desktop, Architecture: x86_64, 16 CPU." title="" id="23" name="Picture"/>
+            <a:graphic>
+              <a:graphicData uri="http://schemas.openxmlformats.org/drawingml/2006/picture">
+                <pic:pic>
+                  <pic:nvPicPr>
+                    <pic:cNvPr descr="../evidencias/02-docker/docker-info-server.png" id="24" name="Picture"/>
+                    <pic:cNvPicPr>
+                      <a:picLocks noChangeArrowheads="1" noChangeAspect="1"/>
+                    </pic:cNvPicPr>
+                  </pic:nvPicPr>
+                  <pic:blipFill>
+                    <a:blip r:embed="rId22"/>
+                    <a:stretch>
+                      <a:fillRect/>
+                    </a:stretch>
+                  </pic:blipFill>
+                  <pic:spPr bwMode="auto">
+                    <a:xfrm>
+                      <a:off x="0" y="0"/>
+                      <a:ext cx="4693920" cy="6000750"/>
+                    </a:xfrm>
+                    <a:prstGeom prst="rect">
+                      <a:avLst/>
+                    </a:prstGeom>
+                    <a:noFill/>
+                    <a:ln w="9525">
+                      <a:noFill/>
+                      <a:headEnd/>
+                      <a:tailEnd/>
+                    </a:ln>
+                  </pic:spPr>
+                </pic:pic>
+              </a:graphicData>
+            </a:graphic>
+          </wp:inline>
+        </w:drawing>
+      </w:r>
+    </w:p>
+    <w:p>
+      <w:pPr>
+        <w:pStyle w:val="ImageCaption"/>
+      </w:pPr>
+      <w:r>
+        <w:t xml:space="preserve">Figura 3.</w:t>
+      </w:r>
+      <w:r>
+        <w:t xml:space="preserve"> </w:t>
+      </w:r>
+      <w:r>
+        <w:rPr>
+          <w:rStyle w:val="VerbatimChar"/>
+        </w:rPr>
+        <w:t xml:space="preserve">docker info</w:t>
+      </w:r>
+      <w:r>
+        <w:t xml:space="preserve"> </w:t>
+      </w:r>
+      <w:r>
+        <w:t xml:space="preserve">— sección del servidor:</w:t>
+      </w:r>
+      <w:r>
+        <w:t xml:space="preserve"> </w:t>
+      </w:r>
+      <w:r>
+        <w:rPr>
+          <w:rStyle w:val="VerbatimChar"/>
+        </w:rPr>
+        <w:t xml:space="preserve">Server Version 29.7.2</w:t>
+      </w:r>
+      <w:r>
         <w:t xml:space="preserve">,</w:t>
       </w:r>
       <w:r>
@@ -2263,25 +2434,34 @@
         <w:rPr>
           <w:rStyle w:val="VerbatimChar"/>
         </w:rPr>
-        <w:t xml:space="preserve">docker compose version</w:t>
-      </w:r>
-      <w:r>
-        <w:t xml:space="preserve"> </w:t>
-      </w:r>
-      <w:r>
-        <w:t xml:space="preserve">y</w:t>
-      </w:r>
-      <w:r>
-        <w:t xml:space="preserve"> </w:t>
-      </w:r>
-      <w:r>
-        <w:rPr>
-          <w:rStyle w:val="VerbatimChar"/>
-        </w:rPr>
-        <w:t xml:space="preserve">docker info</w:t>
-      </w:r>
-      <w:r>
-        <w:t xml:space="preserve">.</w:t>
+        <w:t xml:space="preserve">Storage Driver: overlayfs</w:t>
+      </w:r>
+      <w:r>
+        <w:t xml:space="preserve">,</w:t>
+      </w:r>
+      <w:r>
+        <w:t xml:space="preserve"> </w:t>
+      </w:r>
+      <w:r>
+        <w:rPr>
+          <w:rStyle w:val="VerbatimChar"/>
+        </w:rPr>
+        <w:t xml:space="preserve">Operating System: Docker Desktop</w:t>
+      </w:r>
+      <w:r>
+        <w:t xml:space="preserve">,</w:t>
+      </w:r>
+      <w:r>
+        <w:t xml:space="preserve"> </w:t>
+      </w:r>
+      <w:r>
+        <w:rPr>
+          <w:rStyle w:val="VerbatimChar"/>
+        </w:rPr>
+        <w:t xml:space="preserve">Architecture: x86_64</w:t>
+      </w:r>
+      <w:r>
+        <w:t xml:space="preserve">, 16 CPU.</w:t>
       </w:r>
     </w:p>
     <w:p>
@@ -2381,11 +2561,11 @@
       <w:pPr>
         <w:pStyle w:val="Heading2"/>
       </w:pPr>
-      <w:bookmarkStart w:id="19" w:name="_461d704dbeaffcc10aedbeae3d4d0889dec8f86"/>
+      <w:bookmarkStart w:id="25" w:name="_461d704dbeaffcc10aedbeae3d4d0889dec8f86"/>
       <w:r>
         <w:t xml:space="preserve">8. FASE 03 — Obtención y análisis de la aplicación</w:t>
       </w:r>
-      <w:bookmarkEnd w:id="19"/>
+      <w:bookmarkEnd w:id="25"/>
     </w:p>
     <w:p>
       <w:pPr>
@@ -2811,7 +2991,7 @@
         <w:pStyle w:val="BlockText"/>
       </w:pPr>
       <w:r>
-        <w:t xml:space="preserve">Figura 3. Estructura y análisis de la aplicación de referencia.</w:t>
+        <w:t xml:space="preserve">Figura 4. Estructura y análisis de la aplicación de referencia.</w:t>
       </w:r>
     </w:p>
     <w:p>
@@ -2915,11 +3095,11 @@
       <w:pPr>
         <w:pStyle w:val="Heading2"/>
       </w:pPr>
-      <w:bookmarkStart w:id="20" w:name="_2dcf3bba3672c539fc6a806ef518fe7364c47e4"/>
+      <w:bookmarkStart w:id="26" w:name="_2dcf3bba3672c539fc6a806ef518fe7364c47e4"/>
       <w:r>
         <w:t xml:space="preserve">9. FASE 04 — Dockerfile</w:t>
       </w:r>
-      <w:bookmarkEnd w:id="20"/>
+      <w:bookmarkEnd w:id="26"/>
     </w:p>
     <w:p>
       <w:pPr>
@@ -3461,11 +3641,11 @@
       <w:pPr>
         <w:pStyle w:val="Heading2"/>
       </w:pPr>
-      <w:bookmarkStart w:id="21" w:name="_5c611dec88aaa05e06d332827c421fdca218fa5"/>
+      <w:bookmarkStart w:id="27" w:name="_5c611dec88aaa05e06d332827c421fdca218fa5"/>
       <w:r>
         <w:t xml:space="preserve">10. FASE 05 — Construcción de la imagen</w:t>
       </w:r>
-      <w:bookmarkEnd w:id="21"/>
+      <w:bookmarkEnd w:id="27"/>
     </w:p>
     <w:p>
       <w:pPr>
@@ -3654,7 +3834,7 @@
         <w:pStyle w:val="BlockText"/>
       </w:pPr>
       <w:r>
-        <w:t xml:space="preserve">Figura 4. Proceso de</w:t>
+        <w:t xml:space="preserve">Figura 5. Proceso de</w:t>
       </w:r>
       <w:r>
         <w:t xml:space="preserve"> </w:t>
@@ -3795,11 +3975,11 @@
       <w:pPr>
         <w:pStyle w:val="Heading2"/>
       </w:pPr>
-      <w:bookmarkStart w:id="22" w:name="_a8170a2ffb181195a825e8f851b17ad9f92c524"/>
+      <w:bookmarkStart w:id="28" w:name="_a8170a2ffb181195a825e8f851b17ad9f92c524"/>
       <w:r>
         <w:t xml:space="preserve">11. FASE 06 — Verificación de la imagen</w:t>
       </w:r>
-      <w:bookmarkEnd w:id="22"/>
+      <w:bookmarkEnd w:id="28"/>
     </w:p>
     <w:p>
       <w:pPr>
@@ -4036,7 +4216,7 @@
         <w:pStyle w:val="BlockText"/>
       </w:pPr>
       <w:r>
-        <w:t xml:space="preserve">Figura 5. Imagen</w:t>
+        <w:t xml:space="preserve">Figura 6. Imagen</w:t>
       </w:r>
       <w:r>
         <w:t xml:space="preserve"> </w:t>
@@ -4142,11 +4322,11 @@
       <w:pPr>
         <w:pStyle w:val="Heading2"/>
       </w:pPr>
-      <w:bookmarkStart w:id="23" w:name="_0852d81a53436aeedf2511dd220c3003aad98c2"/>
+      <w:bookmarkStart w:id="29" w:name="_0852d81a53436aeedf2511dd220c3003aad98c2"/>
       <w:r>
         <w:t xml:space="preserve">12. FASE 07 — Creación y ejecución del contenedor</w:t>
       </w:r>
-      <w:bookmarkEnd w:id="23"/>
+      <w:bookmarkEnd w:id="29"/>
     </w:p>
     <w:p>
       <w:pPr>
@@ -4341,10 +4521,57 @@
     </w:p>
     <w:p>
       <w:pPr>
-        <w:pStyle w:val="BlockText"/>
-      </w:pPr>
-      <w:r>
-        <w:t xml:space="preserve">Figura 6. Contenedor</w:t>
+        <w:pStyle w:val="CaptionedFigure"/>
+      </w:pPr>
+      <w:r>
+        <w:drawing>
+          <wp:inline>
+            <wp:extent cx="4907280" cy="2640608"/>
+            <wp:effectExtent b="0" l="0" r="0" t="0"/>
+            <wp:docPr descr="Figura 7. Docker Desktop — el contenedor getting-started (ba5968cb3faa) en ejecución, con el puerto publicado 3000:3000." title="" id="31" name="Picture"/>
+            <a:graphic>
+              <a:graphicData uri="http://schemas.openxmlformats.org/drawingml/2006/picture">
+                <pic:pic>
+                  <pic:nvPicPr>
+                    <pic:cNvPr descr="../evidencias/07-contenedor/docker-desktop-containers.png" id="32" name="Picture"/>
+                    <pic:cNvPicPr>
+                      <a:picLocks noChangeArrowheads="1" noChangeAspect="1"/>
+                    </pic:cNvPicPr>
+                  </pic:nvPicPr>
+                  <pic:blipFill>
+                    <a:blip r:embed="rId30"/>
+                    <a:stretch>
+                      <a:fillRect/>
+                    </a:stretch>
+                  </pic:blipFill>
+                  <pic:spPr bwMode="auto">
+                    <a:xfrm>
+                      <a:off x="0" y="0"/>
+                      <a:ext cx="4907280" cy="2640608"/>
+                    </a:xfrm>
+                    <a:prstGeom prst="rect">
+                      <a:avLst/>
+                    </a:prstGeom>
+                    <a:noFill/>
+                    <a:ln w="9525">
+                      <a:noFill/>
+                      <a:headEnd/>
+                      <a:tailEnd/>
+                    </a:ln>
+                  </pic:spPr>
+                </pic:pic>
+              </a:graphicData>
+            </a:graphic>
+          </wp:inline>
+        </w:drawing>
+      </w:r>
+    </w:p>
+    <w:p>
+      <w:pPr>
+        <w:pStyle w:val="ImageCaption"/>
+      </w:pPr>
+      <w:r>
+        <w:t xml:space="preserve">Figura 7. Docker Desktop — el contenedor</w:t>
       </w:r>
       <w:r>
         <w:t xml:space="preserve"> </w:t>
@@ -4359,7 +4586,28 @@
         <w:t xml:space="preserve"> </w:t>
       </w:r>
       <w:r>
-        <w:t xml:space="preserve">en ejecución y puerto mapeado.</w:t>
+        <w:t xml:space="preserve">(</w:t>
+      </w:r>
+      <w:r>
+        <w:rPr>
+          <w:rStyle w:val="VerbatimChar"/>
+        </w:rPr>
+        <w:t xml:space="preserve">ba5968cb3faa</w:t>
+      </w:r>
+      <w:r>
+        <w:t xml:space="preserve">) en ejecución, con el puerto publicado</w:t>
+      </w:r>
+      <w:r>
+        <w:t xml:space="preserve"> </w:t>
+      </w:r>
+      <w:r>
+        <w:rPr>
+          <w:rStyle w:val="VerbatimChar"/>
+        </w:rPr>
+        <w:t xml:space="preserve">3000:3000</w:t>
+      </w:r>
+      <w:r>
+        <w:t xml:space="preserve">.</w:t>
       </w:r>
     </w:p>
     <w:p>
@@ -4547,11 +4795,11 @@
       <w:pPr>
         <w:pStyle w:val="Heading2"/>
       </w:pPr>
-      <w:bookmarkStart w:id="24" w:name="_0a87b76dd5fdedd6dd252c494565d25b5aaebba"/>
+      <w:bookmarkStart w:id="33" w:name="_0a87b76dd5fdedd6dd252c494565d25b5aaebba"/>
       <w:r>
         <w:t xml:space="preserve">13. FASE 08 — Verificación de la aplicación</w:t>
       </w:r>
-      <w:bookmarkEnd w:id="24"/>
+      <w:bookmarkEnd w:id="33"/>
     </w:p>
     <w:p>
       <w:pPr>
@@ -4701,7 +4949,7 @@
         <w:pStyle w:val="BlockText"/>
       </w:pPr>
       <w:r>
-        <w:t xml:space="preserve">Figura 7. Aplicación en funcionamiento en</w:t>
+        <w:t xml:space="preserve">Figura 8. Aplicación en funcionamiento en</w:t>
       </w:r>
       <w:r>
         <w:t xml:space="preserve"> </w:t>
@@ -4716,7 +4964,7 @@
         <w:t xml:space="preserve"> </w:t>
       </w:r>
       <w:r>
-        <w:t xml:space="preserve">(interfaz React).</w:t>
+        <w:t xml:space="preserve">(interfaz React, verificada por HTTP).</w:t>
       </w:r>
     </w:p>
     <w:p>
@@ -4734,7 +4982,20 @@
         <w:t xml:space="preserve"> </w:t>
       </w:r>
       <w:r>
-        <w:t xml:space="preserve">la captura del navegador la aporta el aprendiz; la verificación funcional aquí documentada se realizó por HTTP (código de estado y respuestas reales).</w:t>
+        <w:t xml:space="preserve">la verificación funcional aquí documentada se realizó por HTTP (código de estado y respuestas reales). La captura del navegador de la aplicación desplegada se muestra en la</w:t>
+      </w:r>
+      <w:r>
+        <w:t xml:space="preserve"> </w:t>
+      </w:r>
+      <w:r>
+        <w:rPr>
+          <w:b/>
+          <w:bCs/>
+        </w:rPr>
+        <w:t xml:space="preserve">Figura 12</w:t>
+      </w:r>
+      <w:r>
+        <w:t xml:space="preserve">.</w:t>
       </w:r>
     </w:p>
     <w:p>
@@ -4817,11 +5078,11 @@
       <w:pPr>
         <w:pStyle w:val="Heading2"/>
       </w:pPr>
-      <w:bookmarkStart w:id="25" w:name="_f9a45087e1331f6bbe51fe6dccc9d2ee2f108d2"/>
+      <w:bookmarkStart w:id="34" w:name="_f9a45087e1331f6bbe51fe6dccc9d2ee2f108d2"/>
       <w:r>
         <w:t xml:space="preserve">14. FASE 09 — Modificación de la aplicación</w:t>
       </w:r>
-      <w:bookmarkEnd w:id="25"/>
+      <w:bookmarkEnd w:id="34"/>
     </w:p>
     <w:p>
       <w:pPr>
@@ -5062,7 +5323,7 @@
         <w:pStyle w:val="BlockText"/>
       </w:pPr>
       <w:r>
-        <w:t xml:space="preserve">Figura 8. Modificación del código fuente en</w:t>
+        <w:t xml:space="preserve">Figura 9. Modificación del código fuente en</w:t>
       </w:r>
       <w:r>
         <w:t xml:space="preserve"> </w:t>
@@ -5143,11 +5404,11 @@
       <w:pPr>
         <w:pStyle w:val="Heading2"/>
       </w:pPr>
-      <w:bookmarkStart w:id="26" w:name="_6f796d35aae1b5645d7c1d5dd318ca0793a4b76"/>
+      <w:bookmarkStart w:id="35" w:name="_6f796d35aae1b5645d7c1d5dd318ca0793a4b76"/>
       <w:r>
         <w:t xml:space="preserve">15. FASE 10 — Reconstrucción de la imagen</w:t>
       </w:r>
-      <w:bookmarkEnd w:id="26"/>
+      <w:bookmarkEnd w:id="35"/>
     </w:p>
     <w:p>
       <w:pPr>
@@ -5315,7 +5576,7 @@
         <w:pStyle w:val="BlockText"/>
       </w:pPr>
       <w:r>
-        <w:t xml:space="preserve">Figura 9. Reconstrucción de la imagen tras la modificación.</w:t>
+        <w:t xml:space="preserve">Figura 10. Reconstrucción de la imagen tras la modificación.</w:t>
       </w:r>
     </w:p>
     <w:p>
@@ -5418,11 +5679,11 @@
       <w:pPr>
         <w:pStyle w:val="Heading2"/>
       </w:pPr>
-      <w:bookmarkStart w:id="27" w:name="_22638e12b665c0e2f81b5c848efa36b70736b2e"/>
+      <w:bookmarkStart w:id="36" w:name="_22638e12b665c0e2f81b5c848efa36b70736b2e"/>
       <w:r>
         <w:t xml:space="preserve">16. FASE 11 — Reemplazo del contenedor anterior</w:t>
       </w:r>
-      <w:bookmarkEnd w:id="27"/>
+      <w:bookmarkEnd w:id="36"/>
     </w:p>
     <w:p>
       <w:pPr>
@@ -5578,7 +5839,7 @@
         <w:pStyle w:val="BlockText"/>
       </w:pPr>
       <w:r>
-        <w:t xml:space="preserve">Figura 10. Detención y eliminación del contenedor anterior.</w:t>
+        <w:t xml:space="preserve">Figura 11. Detención y eliminación del contenedor anterior.</w:t>
       </w:r>
     </w:p>
     <w:p>
@@ -5756,11 +6017,11 @@
       <w:pPr>
         <w:pStyle w:val="Heading2"/>
       </w:pPr>
-      <w:bookmarkStart w:id="28" w:name="_5cf42412138635733a6f83de76eaaf84cd4f8fe"/>
+      <w:bookmarkStart w:id="37" w:name="_5cf42412138635733a6f83de76eaaf84cd4f8fe"/>
       <w:r>
         <w:t xml:space="preserve">17. FASE 12 — Nuevo contenedor y validación de la modificación</w:t>
       </w:r>
-      <w:bookmarkEnd w:id="28"/>
+      <w:bookmarkEnd w:id="37"/>
     </w:p>
     <w:p>
       <w:pPr>
@@ -5930,10 +6191,92 @@
     </w:p>
     <w:p>
       <w:pPr>
+        <w:pStyle w:val="CaptionedFigure"/>
+      </w:pPr>
+      <w:r>
+        <w:drawing>
+          <wp:inline>
+            <wp:extent cx="4907280" cy="2648292"/>
+            <wp:effectExtent b="0" l="0" r="0" t="0"/>
+            <wp:docPr descr="Figura 12. Interfaz Todo App servida por el contenedor final en http://localhost:3000, con tareas gestionadas desde el navegador." title="" id="39" name="Picture"/>
+            <a:graphic>
+              <a:graphicData uri="http://schemas.openxmlformats.org/drawingml/2006/picture">
+                <pic:pic>
+                  <pic:nvPicPr>
+                    <pic:cNvPr descr="../evidencias/12-validacion/app-navegador.png" id="40" name="Picture"/>
+                    <pic:cNvPicPr>
+                      <a:picLocks noChangeArrowheads="1" noChangeAspect="1"/>
+                    </pic:cNvPicPr>
+                  </pic:nvPicPr>
+                  <pic:blipFill>
+                    <a:blip r:embed="rId38"/>
+                    <a:stretch>
+                      <a:fillRect/>
+                    </a:stretch>
+                  </pic:blipFill>
+                  <pic:spPr bwMode="auto">
+                    <a:xfrm>
+                      <a:off x="0" y="0"/>
+                      <a:ext cx="4907280" cy="2648292"/>
+                    </a:xfrm>
+                    <a:prstGeom prst="rect">
+                      <a:avLst/>
+                    </a:prstGeom>
+                    <a:noFill/>
+                    <a:ln w="9525">
+                      <a:noFill/>
+                      <a:headEnd/>
+                      <a:tailEnd/>
+                    </a:ln>
+                  </pic:spPr>
+                </pic:pic>
+              </a:graphicData>
+            </a:graphic>
+          </wp:inline>
+        </w:drawing>
+      </w:r>
+    </w:p>
+    <w:p>
+      <w:pPr>
+        <w:pStyle w:val="ImageCaption"/>
+      </w:pPr>
+      <w:r>
+        <w:t xml:space="preserve">Figura 12. Interfaz</w:t>
+      </w:r>
+      <w:r>
+        <w:t xml:space="preserve"> </w:t>
+      </w:r>
+      <w:r>
+        <w:rPr>
+          <w:rStyle w:val="VerbatimChar"/>
+        </w:rPr>
+        <w:t xml:space="preserve">Todo App</w:t>
+      </w:r>
+      <w:r>
+        <w:t xml:space="preserve"> </w:t>
+      </w:r>
+      <w:r>
+        <w:t xml:space="preserve">servida por el contenedor final en</w:t>
+      </w:r>
+      <w:r>
+        <w:t xml:space="preserve"> </w:t>
+      </w:r>
+      <w:r>
+        <w:rPr>
+          <w:rStyle w:val="VerbatimChar"/>
+        </w:rPr>
+        <w:t xml:space="preserve">http://localhost:3000</w:t>
+      </w:r>
+      <w:r>
+        <w:t xml:space="preserve">, con tareas gestionadas desde el navegador.</w:t>
+      </w:r>
+    </w:p>
+    <w:p>
+      <w:pPr>
         <w:pStyle w:val="BlockText"/>
       </w:pPr>
       <w:r>
-        <w:t xml:space="preserve">Figura 11. Aplicación modificada ejecutándose dentro del nuevo contenedor.</w:t>
+        <w:t xml:space="preserve">Figura 12. Aplicación modificada ejecutándose dentro del nuevo contenedor (captura del navegador).</w:t>
       </w:r>
     </w:p>
     <w:p>
@@ -5999,11 +6342,11 @@
       <w:pPr>
         <w:pStyle w:val="Heading2"/>
       </w:pPr>
-      <w:bookmarkStart w:id="29" w:name="_34d82a58612ea834f1778d158628f83f5657fbf"/>
+      <w:bookmarkStart w:id="41" w:name="_34d82a58612ea834f1778d158628f83f5657fbf"/>
       <w:r>
         <w:t xml:space="preserve">18. FASE 13 — Docker Hub</w:t>
       </w:r>
-      <w:bookmarkEnd w:id="29"/>
+      <w:bookmarkEnd w:id="41"/>
     </w:p>
     <w:p>
       <w:pPr>
@@ -6145,11 +6488,11 @@
       <w:pPr>
         <w:pStyle w:val="Heading2"/>
       </w:pPr>
-      <w:bookmarkStart w:id="30" w:name="_e722c5ad74a544aeeb6dcb5609f5be07c4e98ed"/>
+      <w:bookmarkStart w:id="42" w:name="_e722c5ad74a544aeeb6dcb5609f5be07c4e98ed"/>
       <w:r>
         <w:t xml:space="preserve">19. FASE 14 — Pruebas finales (verificación automatizada)</w:t>
       </w:r>
-      <w:bookmarkEnd w:id="30"/>
+      <w:bookmarkEnd w:id="42"/>
     </w:p>
     <w:p>
       <w:pPr>
@@ -6390,11 +6733,11 @@
       <w:pPr>
         <w:pStyle w:val="Heading2"/>
       </w:pPr>
-      <w:bookmarkStart w:id="31" w:name="_4c5d2d2841a507534333f2b04e2a78ef0397df6"/>
+      <w:bookmarkStart w:id="43" w:name="_4c5d2d2841a507534333f2b04e2a78ef0397df6"/>
       <w:r>
         <w:t xml:space="preserve">20. Matriz de cumplimiento</w:t>
       </w:r>
-      <w:bookmarkEnd w:id="31"/>
+      <w:bookmarkEnd w:id="43"/>
     </w:p>
     <w:tbl>
       <w:tblPr>
@@ -6739,11 +7082,11 @@
       <w:pPr>
         <w:pStyle w:val="Heading2"/>
       </w:pPr>
-      <w:bookmarkStart w:id="32" w:name="_82e399dc0e0fe414515e6311e26b1bcf0a7e940"/>
+      <w:bookmarkStart w:id="44" w:name="_82e399dc0e0fe414515e6311e26b1bcf0a7e940"/>
       <w:r>
         <w:t xml:space="preserve">21. Resultados obtenidos</w:t>
       </w:r>
-      <w:bookmarkEnd w:id="32"/>
+      <w:bookmarkEnd w:id="44"/>
     </w:p>
     <w:p>
       <w:pPr>
@@ -6881,11 +7224,11 @@
       <w:pPr>
         <w:pStyle w:val="Heading2"/>
       </w:pPr>
-      <w:bookmarkStart w:id="33" w:name="_conclusiones"/>
+      <w:bookmarkStart w:id="45" w:name="_conclusiones"/>
       <w:r>
         <w:t xml:space="preserve">22. Conclusiones</w:t>
       </w:r>
-      <w:bookmarkEnd w:id="33"/>
+      <w:bookmarkEnd w:id="45"/>
     </w:p>
     <w:p>
       <w:pPr>
@@ -7225,11 +7568,11 @@
       <w:pPr>
         <w:pStyle w:val="Heading2"/>
       </w:pPr>
-      <w:bookmarkStart w:id="34" w:name="_anexos"/>
+      <w:bookmarkStart w:id="46" w:name="_anexos"/>
       <w:r>
         <w:t xml:space="preserve">23. Anexos</w:t>
       </w:r>
-      <w:bookmarkEnd w:id="34"/>
+      <w:bookmarkEnd w:id="46"/>
     </w:p>
     <w:p>
       <w:pPr>
@@ -7433,28 +7776,58 @@
           <w:b/>
           <w:bCs/>
         </w:rPr>
-        <w:t xml:space="preserve">Anexo G. Capturas manuales (aportadas por el aprendiz):</w:t>
-      </w:r>
-      <w:r>
-        <w:t xml:space="preserve"> </w:t>
-      </w:r>
-      <w:r>
-        <w:t xml:space="preserve">pendientes de inserción — capturas de Docker Desktop y del navegador en</w:t>
-      </w:r>
-      <w:r>
-        <w:t xml:space="preserve"> </w:t>
-      </w:r>
-      <w:r>
-        <w:rPr>
-          <w:rStyle w:val="VerbatimChar"/>
-        </w:rPr>
-        <w:t xml:space="preserve">http://localhost:3000</w:t>
-      </w:r>
-      <w:r>
-        <w:t xml:space="preserve"> </w:t>
-      </w:r>
-      <w:r>
-        <w:t xml:space="preserve">(estado vacío modificado).</w:t>
+        <w:t xml:space="preserve">Anexo G. Capturas de pantalla (reales, aportadas por el aprendiz):</w:t>
+      </w:r>
+      <w:r>
+        <w:t xml:space="preserve"> </w:t>
+      </w:r>
+      <w:r>
+        <w:rPr>
+          <w:rStyle w:val="VerbatimChar"/>
+        </w:rPr>
+        <w:t xml:space="preserve">evidencias/02-docker/docker-version-info.png</w:t>
+      </w:r>
+      <w:r>
+        <w:t xml:space="preserve">,</w:t>
+      </w:r>
+      <w:r>
+        <w:t xml:space="preserve"> </w:t>
+      </w:r>
+      <w:r>
+        <w:rPr>
+          <w:rStyle w:val="VerbatimChar"/>
+        </w:rPr>
+        <w:t xml:space="preserve">evidencias/02-docker/docker-info-server.png</w:t>
+      </w:r>
+      <w:r>
+        <w:t xml:space="preserve">,</w:t>
+      </w:r>
+      <w:r>
+        <w:t xml:space="preserve"> </w:t>
+      </w:r>
+      <w:r>
+        <w:rPr>
+          <w:rStyle w:val="VerbatimChar"/>
+        </w:rPr>
+        <w:t xml:space="preserve">evidencias/07-contenedor/docker-desktop-containers.png</w:t>
+      </w:r>
+      <w:r>
+        <w:t xml:space="preserve"> </w:t>
+      </w:r>
+      <w:r>
+        <w:t xml:space="preserve">y</w:t>
+      </w:r>
+      <w:r>
+        <w:t xml:space="preserve"> </w:t>
+      </w:r>
+      <w:r>
+        <w:rPr>
+          <w:rStyle w:val="VerbatimChar"/>
+        </w:rPr>
+        <w:t xml:space="preserve">evidencias/12-validacion/app-navegador.png</w:t>
+      </w:r>
+      <w:r>
+        <w:t xml:space="preserve">.</w:t>
       </w:r>
       <w:r>
         <w:t xml:space="preserve"> </w:t>
@@ -7464,7 +7837,7 @@
           <w:i/>
           <w:iCs/>
         </w:rPr>
-        <w:t xml:space="preserve">No se generan capturas sintéticas.</w:t>
+        <w:t xml:space="preserve">No se generan capturas sintéticas; todas las imágenes incluidas corresponden a capturas reales del entorno.</w:t>
       </w:r>
     </w:p>
     <w:sectPr>

</xml_diff>